<commit_message>
Report: plain list of work in introduction, 11pt abstract and references
</commit_message>
<xml_diff>
--- a/report/group_XX_report.docx
+++ b/report/group_XX_report.docx
@@ -83,8 +83,8 @@
       </w:pPr>
       <w:r>
         <w:rPr>
-          <w:sz w:val="20"/>
-          <w:szCs w:val="20"/>
+          <w:sz w:val="22"/>
+          <w:szCs w:val="22"/>
         </w:rPr>
         <w:t xml:space="preserve">Text-to-image search engines embed captions and photos into a shared space with a contrastive model such as CLIP, then answer each caption with an approximate nearest neighbour (ANN) index built over the image vectors. Such indexes are normally built and tuned with the stored data, yet the queries they serve come from the text encoder, which CLIP places in a different region of the space (the </w:t>
       </w:r>
@@ -92,15 +92,15 @@
         <w:rPr>
           <w:i/>
           <w:iCs/>
-          <w:sz w:val="20"/>
-          <w:szCs w:val="20"/>
+          <w:sz w:val="22"/>
+          <w:szCs w:val="22"/>
         </w:rPr>
         <w:t xml:space="preserve">modality gap</w:t>
       </w:r>
       <w:r>
         <w:rPr>
-          <w:sz w:val="20"/>
-          <w:szCs w:val="20"/>
+          <w:sz w:val="22"/>
+          <w:szCs w:val="22"/>
         </w:rPr>
         <w:t xml:space="preserve">). We present a controlled comparison of three ANN families — random-projection LSH (hashing), Product Quantization (quantization) and HNSW (graph) — on MS-COCO (122k images) and LAION (1M images), searching every index with both image and text queries under identical settings. All three methods lose recall on text queries at every operating point, and, contrary to the intuition that a data-independent method should be unaffected, LSH loses the most (up to 0.40 recall@100), ahead of PQ (0.17) and HNSW (0.19). We explain these results with a score-margin model: text queries have </w:t>
       </w:r>
@@ -108,15 +108,15 @@
         <w:rPr>
           <w:i/>
           <w:iCs/>
-          <w:sz w:val="20"/>
-          <w:szCs w:val="20"/>
+          <w:sz w:val="22"/>
+          <w:szCs w:val="22"/>
         </w:rPr>
         <w:t xml:space="preserve">low neighbour contrast</w:t>
       </w:r>
       <w:r>
         <w:rPr>
-          <w:sz w:val="20"/>
-          <w:szCs w:val="20"/>
+          <w:sz w:val="22"/>
+          <w:szCs w:val="22"/>
         </w:rPr>
         <w:t xml:space="preserve">, which magnifies the error of approximate scoring (LSH, PQ), and they lie </w:t>
       </w:r>
@@ -124,17 +124,17 @@
         <w:rPr>
           <w:i/>
           <w:iCs/>
-          <w:sz w:val="20"/>
-          <w:szCs w:val="20"/>
+          <w:sz w:val="22"/>
+          <w:szCs w:val="22"/>
         </w:rPr>
         <w:t xml:space="preserve">far from all images</w:t>
       </w:r>
       <w:r>
         <w:rPr>
-          <w:sz w:val="20"/>
-          <w:szCs w:val="20"/>
+          <w:sz w:val="22"/>
+          <w:szCs w:val="22"/>
         </w:rPr>
-        <w:t xml:space="preserve">, which weakens greedy graph routing (HNSW), increasingly so as the corpus grows. A binomial analysis of LSH predicts the measured loss almost exactly. Guided by the model, we propose three query-aware construction methods that preserve the exact ground truth: caption-guided HNSW edges raise COCO text recall from 0.88 to 0.95 at no memory cost, query-weighted OPQ raises PQ text recall from 0.51 to 0.79 at 64 bytes per vector, and modality-aware centring roughly doubles LSH text recall at mid-range code lengths.</w:t>
+        <w:t xml:space="preserve">, which weakens greedy graph routing (HNSW), increasingly so as the corpus grows. A binomial analysis of LSH predicts the measured loss almost exactly. Guided by this, we improve each baseline for text queries while keeping the exact ground truth: caption-guided HNSW edges raise COCO text recall from 0.88 to 0.95 at no memory cost, query-weighted OPQ raises PQ text recall from 0.51 to 0.79 at 64 bytes per vector, and modality-aware centring roughly doubles LSH text recall at mid-range code lengths.</w:t>
       </w:r>
     </w:p>
     <w:p>
@@ -147,8 +147,8 @@
         <w:rPr>
           <w:b/>
           <w:bCs/>
-          <w:sz w:val="20"/>
-          <w:szCs w:val="20"/>
+          <w:sz w:val="22"/>
+          <w:szCs w:val="22"/>
         </w:rPr>
         <w:t xml:space="preserve">Keywords: </w:t>
       </w:r>
@@ -156,8 +156,8 @@
         <w:rPr>
           <w:i/>
           <w:iCs/>
-          <w:sz w:val="20"/>
-          <w:szCs w:val="20"/>
+          <w:sz w:val="22"/>
+          <w:szCs w:val="22"/>
         </w:rPr>
         <w:t xml:space="preserve">approximate nearest neighbour search, locality-sensitive hashing, product quantization, HNSW, cross-modal retrieval, CLIP, out-of-distribution queries</w:t>
       </w:r>
@@ -246,7 +246,7 @@
         <w:jc w:val="both"/>
       </w:pPr>
       <w:r>
-        <w:t xml:space="preserve">This report studies that question through a controlled experiment in which the index, its parameters and the ground truth are held fixed and only the query modality changes. We select one representative of each major ANN family, so that differences can be attributed to mechanisms rather than implementations: random-projection </w:t>
+        <w:t xml:space="preserve">We study this with a controlled experiment in which the index, its parameters and the ground truth are held fixed and only the query modality changes. We select one representative of each major ANN family: random-projection </w:t>
       </w:r>
       <w:r>
         <w:rPr>
@@ -276,7 +276,7 @@
         <w:t xml:space="preserve">HNSW</w:t>
       </w:r>
       <w:r>
-        <w:t xml:space="preserve"> (graph; neighbourhood structure learned from data), which lies outside the syllabus and is the default index of pgvector, Milvus and Weaviate. We address three research questions:</w:t>
+        <w:t xml:space="preserve"> (graph; neighbourhood structure learned from data), which lies outside the syllabus and is the default index of pgvector, Milvus and Weaviate. In this report we:</w:t>
       </w:r>
     </w:p>
     <w:p>
@@ -294,10 +294,10 @@
           <w:b/>
           <w:bCs/>
         </w:rPr>
-        <w:t xml:space="preserve">RQ1.</w:t>
-      </w:r>
-      <w:r>
-        <w:t xml:space="preserve"> How do hashing, quantization and graph indexes trade accuracy, speed and memory on CLIP embeddings?</w:t>
+        <w:t xml:space="preserve">Benchmark</w:t>
+      </w:r>
+      <w:r>
+        <w:t xml:space="preserve"> the three methods and exact search on COCO (122k images) and LAION (1M images), sweeping each method's main parameter and searching every index with both image and text queries, to compare recall, speed, memory and build time.</w:t>
       </w:r>
     </w:p>
     <w:p>
@@ -315,10 +315,10 @@
           <w:b/>
           <w:bCs/>
         </w:rPr>
-        <w:t xml:space="preserve">RQ2.</w:t>
-      </w:r>
-      <w:r>
-        <w:t xml:space="preserve"> How much recall does each family lose when the query is a caption rather than an image, and can a larger budget recover it?</w:t>
+        <w:t xml:space="preserve">Analyse</w:t>
+      </w:r>
+      <w:r>
+        <w:t xml:space="preserve"> why text queries lose recall, by measuring how they differ from image queries and relating each query's recall to those differences; for LSH, a simple probabilistic model predicts the measured loss.</w:t>
       </w:r>
     </w:p>
     <w:p>
@@ -336,19 +336,10 @@
           <w:b/>
           <w:bCs/>
         </w:rPr>
-        <w:t xml:space="preserve">RQ3.</w:t>
-      </w:r>
-      <w:r>
-        <w:t xml:space="preserve"> Which property of text queries causes the loss, and can index construction be adapted to it without changing the ground truth?</w:t>
-      </w:r>
-    </w:p>
-    <w:p>
-      <w:pPr>
-        <w:spacing w:after="120" w:line="264"/>
-        <w:jc w:val="both"/>
-      </w:pPr>
-      <w:r>
-        <w:t xml:space="preserve">Our contributions are as follows:</w:t>
+        <w:t xml:space="preserve">Run ablations</w:t>
+      </w:r>
+      <w:r>
+        <w:t xml:space="preserve"> on HNSW's build parameters, the corpus size and the offset between the two modalities.</w:t>
       </w:r>
     </w:p>
     <w:p>
@@ -356,51 +347,20 @@
         <w:pStyle w:val="ListParagraph"/>
         <w:numPr>
           <w:ilvl w:val="0"/>
-          <w:numId w:val="3"/>
+          <w:numId w:val="2"/>
         </w:numPr>
         <w:spacing w:after="70" w:line="256"/>
         <w:jc w:val="both"/>
       </w:pPr>
       <w:r>
-        <w:t xml:space="preserve">A controlled cross-modal benchmark of three ANN families on two datasets that differ in scale (122k vs 1M images) and text style (clean captions vs web text).</w:t>
-      </w:r>
-    </w:p>
-    <w:p>
-      <w:pPr>
-        <w:pStyle w:val="ListParagraph"/>
-        <w:numPr>
-          <w:ilvl w:val="0"/>
-          <w:numId w:val="3"/>
-        </w:numPr>
-        <w:spacing w:after="70" w:line="256"/>
-        <w:jc w:val="both"/>
-      </w:pPr>
-      <w:r>
-        <w:t xml:space="preserve">A </w:t>
-      </w:r>
-      <w:r>
         <w:rPr>
-          <w:i/>
-          <w:iCs/>
+          <w:b/>
+          <w:bCs/>
         </w:rPr>
-        <w:t xml:space="preserve">score-margin</w:t>
-      </w:r>
-      <w:r>
-        <w:t xml:space="preserve"> account of the modality penalty, which identifies two query properties — low neighbour contrast and distance from the data — and predicts which family each property affects. For LSH the account is quantitative: a binomial model reproduces the measured swap rates and the factor-of-eight increase in code length that text queries require.</w:t>
-      </w:r>
-    </w:p>
-    <w:p>
-      <w:pPr>
-        <w:pStyle w:val="ListParagraph"/>
-        <w:numPr>
-          <w:ilvl w:val="0"/>
-          <w:numId w:val="3"/>
-        </w:numPr>
-        <w:spacing w:after="70" w:line="256"/>
-        <w:jc w:val="both"/>
-      </w:pPr>
-      <w:r>
-        <w:t xml:space="preserve">Three query-aware construction methods, one per family, that use a sample of training captions but leave the search algorithm and the exact ground truth unchanged, together with ablations of their components and two instructive negative results.</w:t>
+        <w:t xml:space="preserve">Improve the baselines</w:t>
+      </w:r>
+      <w:r>
+        <w:t xml:space="preserve"> for text queries using a sample of training captions, adapting ideas from prior work: modality-aware centring for LSH, query-weighted OPQ for PQ, and caption-guided edges for HNSW. None of them changes the search algorithm or the exact ground truth.</w:t>
       </w:r>
     </w:p>
     <w:p>
@@ -409,7 +369,7 @@
         <w:jc w:val="both"/>
       </w:pPr>
       <w:r>
-        <w:t xml:space="preserve">Section 2 reviews the search problem and the modality gap. Section 3 describes the three methods with the formulation used in the course, then develops the score-margin model and derives the query-aware extensions from it. Section 4 reports the experiments, Section 5 discusses strengths, weaknesses and limitations, and Section 6 concludes.</w:t>
+        <w:t xml:space="preserve">Section 2 reviews the search problem and the modality gap. Section 3 describes the three methods with the formulation used in the course, a simple model of when they fail on text queries, and the improvements we test. Section 4 reports the experiments, Section 5 discusses strengths, weaknesses and limitations, and Section 6 concludes.</w:t>
       </w:r>
     </w:p>
     <w:p>
@@ -8692,7 +8652,7 @@
         <w:pStyle w:val="Heading2"/>
       </w:pPr>
       <w:r>
-        <w:t xml:space="preserve">4.3 Accuracy–efficiency trade-off (RQ1)</w:t>
+        <w:t xml:space="preserve">4.3 Accuracy–efficiency trade-off</w:t>
       </w:r>
     </w:p>
     <w:p>
@@ -11080,7 +11040,7 @@
         <w:pStyle w:val="ListParagraph"/>
         <w:numPr>
           <w:ilvl w:val="0"/>
-          <w:numId w:val="3"/>
+          <w:numId w:val="2"/>
         </w:numPr>
         <w:spacing w:after="70" w:line="256"/>
         <w:jc w:val="both"/>
@@ -11119,7 +11079,7 @@
         <w:pStyle w:val="ListParagraph"/>
         <w:numPr>
           <w:ilvl w:val="0"/>
-          <w:numId w:val="3"/>
+          <w:numId w:val="2"/>
         </w:numPr>
         <w:spacing w:after="70" w:line="256"/>
         <w:jc w:val="both"/>
@@ -11140,7 +11100,7 @@
         <w:pStyle w:val="ListParagraph"/>
         <w:numPr>
           <w:ilvl w:val="0"/>
-          <w:numId w:val="3"/>
+          <w:numId w:val="2"/>
         </w:numPr>
         <w:spacing w:after="70" w:line="256"/>
         <w:jc w:val="both"/>
@@ -11999,7 +11959,7 @@
         <w:pStyle w:val="Heading2"/>
       </w:pPr>
       <w:r>
-        <w:t xml:space="preserve">4.4 The cost of querying with text (RQ2)</w:t>
+        <w:t xml:space="preserve">4.4 The cost of querying with text</w:t>
       </w:r>
     </w:p>
     <w:p>
@@ -13266,7 +13226,7 @@
         <w:pStyle w:val="ListParagraph"/>
         <w:numPr>
           <w:ilvl w:val="0"/>
-          <w:numId w:val="3"/>
+          <w:numId w:val="2"/>
         </w:numPr>
         <w:spacing w:after="70" w:line="256"/>
         <w:jc w:val="both"/>
@@ -13295,7 +13255,7 @@
         <w:pStyle w:val="ListParagraph"/>
         <w:numPr>
           <w:ilvl w:val="0"/>
-          <w:numId w:val="3"/>
+          <w:numId w:val="2"/>
         </w:numPr>
         <w:spacing w:after="70" w:line="256"/>
         <w:jc w:val="both"/>
@@ -13316,7 +13276,7 @@
         <w:pStyle w:val="ListParagraph"/>
         <w:numPr>
           <w:ilvl w:val="0"/>
-          <w:numId w:val="3"/>
+          <w:numId w:val="2"/>
         </w:numPr>
         <w:spacing w:after="70" w:line="256"/>
         <w:jc w:val="both"/>
@@ -14200,7 +14160,7 @@
         <w:pStyle w:val="Heading2"/>
       </w:pPr>
       <w:r>
-        <w:t xml:space="preserve">4.5 Testing the score-margin model (RQ3)</w:t>
+        <w:t xml:space="preserve">4.5 Testing the score-margin model</w:t>
       </w:r>
     </w:p>
     <w:p>
@@ -18680,7 +18640,7 @@
         <w:pStyle w:val="ListParagraph"/>
         <w:numPr>
           <w:ilvl w:val="0"/>
-          <w:numId w:val="3"/>
+          <w:numId w:val="2"/>
         </w:numPr>
         <w:spacing w:after="70" w:line="256"/>
         <w:jc w:val="both"/>
@@ -18701,7 +18661,7 @@
         <w:pStyle w:val="ListParagraph"/>
         <w:numPr>
           <w:ilvl w:val="0"/>
-          <w:numId w:val="3"/>
+          <w:numId w:val="2"/>
         </w:numPr>
         <w:spacing w:after="70" w:line="256"/>
         <w:jc w:val="both"/>
@@ -18722,7 +18682,7 @@
         <w:pStyle w:val="ListParagraph"/>
         <w:numPr>
           <w:ilvl w:val="0"/>
-          <w:numId w:val="3"/>
+          <w:numId w:val="2"/>
         </w:numPr>
         <w:spacing w:after="70" w:line="256"/>
         <w:jc w:val="both"/>
@@ -20299,7 +20259,7 @@
         <w:pStyle w:val="ListParagraph"/>
         <w:numPr>
           <w:ilvl w:val="0"/>
-          <w:numId w:val="3"/>
+          <w:numId w:val="2"/>
         </w:numPr>
         <w:spacing w:after="70" w:line="256"/>
         <w:jc w:val="both"/>
@@ -20328,7 +20288,7 @@
         <w:pStyle w:val="ListParagraph"/>
         <w:numPr>
           <w:ilvl w:val="0"/>
-          <w:numId w:val="3"/>
+          <w:numId w:val="2"/>
         </w:numPr>
         <w:spacing w:after="70" w:line="256"/>
         <w:jc w:val="both"/>
@@ -20349,7 +20309,7 @@
         <w:pStyle w:val="ListParagraph"/>
         <w:numPr>
           <w:ilvl w:val="0"/>
-          <w:numId w:val="3"/>
+          <w:numId w:val="2"/>
         </w:numPr>
         <w:spacing w:after="70" w:line="256"/>
         <w:jc w:val="both"/>
@@ -20370,7 +20330,7 @@
         <w:pStyle w:val="ListParagraph"/>
         <w:numPr>
           <w:ilvl w:val="0"/>
-          <w:numId w:val="3"/>
+          <w:numId w:val="2"/>
         </w:numPr>
         <w:spacing w:after="70" w:line="256"/>
         <w:jc w:val="both"/>
@@ -20517,7 +20477,7 @@
         <w:pStyle w:val="ListParagraph"/>
         <w:numPr>
           <w:ilvl w:val="0"/>
-          <w:numId w:val="3"/>
+          <w:numId w:val="2"/>
         </w:numPr>
         <w:spacing w:after="70" w:line="256"/>
         <w:jc w:val="both"/>
@@ -20538,7 +20498,7 @@
         <w:pStyle w:val="ListParagraph"/>
         <w:numPr>
           <w:ilvl w:val="0"/>
-          <w:numId w:val="3"/>
+          <w:numId w:val="2"/>
         </w:numPr>
         <w:spacing w:after="70" w:line="256"/>
         <w:jc w:val="both"/>
@@ -20559,7 +20519,7 @@
         <w:pStyle w:val="ListParagraph"/>
         <w:numPr>
           <w:ilvl w:val="0"/>
-          <w:numId w:val="3"/>
+          <w:numId w:val="2"/>
         </w:numPr>
         <w:spacing w:after="70" w:line="256"/>
         <w:jc w:val="both"/>
@@ -20691,7 +20651,7 @@
         <w:pStyle w:val="ListParagraph"/>
         <w:numPr>
           <w:ilvl w:val="0"/>
-          <w:numId w:val="3"/>
+          <w:numId w:val="2"/>
         </w:numPr>
         <w:spacing w:after="70" w:line="256"/>
         <w:jc w:val="both"/>
@@ -20712,7 +20672,7 @@
         <w:pStyle w:val="ListParagraph"/>
         <w:numPr>
           <w:ilvl w:val="0"/>
-          <w:numId w:val="3"/>
+          <w:numId w:val="2"/>
         </w:numPr>
         <w:spacing w:after="70" w:line="256"/>
         <w:jc w:val="both"/>
@@ -20733,7 +20693,7 @@
         <w:pStyle w:val="ListParagraph"/>
         <w:numPr>
           <w:ilvl w:val="0"/>
-          <w:numId w:val="3"/>
+          <w:numId w:val="2"/>
         </w:numPr>
         <w:spacing w:after="70" w:line="256"/>
         <w:jc w:val="both"/>
@@ -21469,7 +21429,7 @@
         <w:pStyle w:val="ListParagraph"/>
         <w:numPr>
           <w:ilvl w:val="0"/>
-          <w:numId w:val="3"/>
+          <w:numId w:val="2"/>
         </w:numPr>
         <w:spacing w:after="70" w:line="256"/>
         <w:jc w:val="both"/>
@@ -21490,7 +21450,7 @@
         <w:pStyle w:val="ListParagraph"/>
         <w:numPr>
           <w:ilvl w:val="0"/>
-          <w:numId w:val="3"/>
+          <w:numId w:val="2"/>
         </w:numPr>
         <w:spacing w:after="70" w:line="256"/>
         <w:jc w:val="both"/>
@@ -21519,7 +21479,7 @@
         <w:pStyle w:val="ListParagraph"/>
         <w:numPr>
           <w:ilvl w:val="0"/>
-          <w:numId w:val="3"/>
+          <w:numId w:val="2"/>
         </w:numPr>
         <w:spacing w:after="70" w:line="256"/>
         <w:jc w:val="both"/>
@@ -21548,13 +21508,98 @@
         <w:pStyle w:val="ListParagraph"/>
         <w:numPr>
           <w:ilvl w:val="0"/>
-          <w:numId w:val="3"/>
+          <w:numId w:val="2"/>
         </w:numPr>
         <w:spacing w:after="70" w:line="256"/>
         <w:jc w:val="both"/>
       </w:pPr>
       <w:r>
         <w:t xml:space="preserve">We use one encoder (CLIP ViT-B/32); newer encoders may have a smaller modality gap.</w:t>
+      </w:r>
+    </w:p>
+    <w:p>
+      <w:pPr>
+        <w:pStyle w:val="ListParagraph"/>
+        <w:numPr>
+          <w:ilvl w:val="0"/>
+          <w:numId w:val="2"/>
+        </w:numPr>
+        <w:spacing w:after="70" w:line="256"/>
+        <w:jc w:val="both"/>
+      </w:pPr>
+      <w:r>
+        <w:t xml:space="preserve">Timing is single-threaded on CPU. To finish in time, independent jobs ran concurrently on separate cores of one server; this may lower absolute QPS (mainly for memory-bound scans on LAION) but never affects recall.</w:t>
+      </w:r>
+    </w:p>
+    <w:p>
+      <w:pPr>
+        <w:pStyle w:val="ListParagraph"/>
+        <w:numPr>
+          <w:ilvl w:val="0"/>
+          <w:numId w:val="2"/>
+        </w:numPr>
+        <w:spacing w:after="70" w:line="256"/>
+        <w:jc w:val="both"/>
+      </w:pPr>
+      <w:r>
+        <w:t xml:space="preserve">Recall is measured against exact search rather than human relevance, so an approximate “miss” may still be a relevant image (Figure 12).</w:t>
+      </w:r>
+    </w:p>
+    <w:p>
+      <w:pPr>
+        <w:pStyle w:val="ListParagraph"/>
+        <w:numPr>
+          <w:ilvl w:val="0"/>
+          <w:numId w:val="2"/>
+        </w:numPr>
+        <w:spacing w:after="70" w:line="256"/>
+        <w:jc w:val="both"/>
+      </w:pPr>
+      <w:r>
+        <w:t xml:space="preserve">The query-aware methods require a sample of training queries from the same distribution as the real ones; we did not study robustness to a shift between the two.</w:t>
+      </w:r>
+    </w:p>
+    <w:p>
+      <w:pPr>
+        <w:pStyle w:val="Heading1"/>
+      </w:pPr>
+      <w:r>
+        <w:t xml:space="preserve">6 Conclusion</w:t>
+      </w:r>
+    </w:p>
+    <w:p>
+      <w:pPr>
+        <w:spacing w:after="120" w:line="264"/>
+        <w:jc w:val="both"/>
+      </w:pPr>
+      <w:r>
+        <w:t xml:space="preserve">We compared hashing (LSH), quantization (PQ) and graph (HNSW) indexes for text-to-image search on CLIP embeddings, on COCO (122k images) and LAION (1M images), searching each index with both image and text queries. With image queries the classic trade-off holds: HNSW is the fastest and most accurate, PQ the most compact, and LSH the cheapest to build. With text queries every method loses recall at every setting — the data-independent LSH most of all.</w:t>
+      </w:r>
+    </w:p>
+    <w:p>
+      <w:pPr>
+        <w:spacing w:after="120" w:line="264"/>
+        <w:jc w:val="both"/>
+      </w:pPr>
+      <w:r>
+        <w:t xml:space="preserve">A score-margin model explains these results. Text queries' true neighbours are bunched together, which magnifies the error of approximate scoring (LSH, PQ); for LSH a binomial analysis reproduces the measured swap rates and the eight-fold increase in code length that text queries require. Text queries also lie far from every image, which weakens greedy graph routing (HNSW) increasingly as the corpus grows. The model led to three query-aware construction methods that keep the exact ground truth: caption-guided edges in HNSW's unused slots (COCO text recall 0.88 → 0.95, no extra memory), query-weighted OPQ (PQ text recall 0.51 → 0.79 at 64 bytes), and modality-aware LSH centring (text recall roughly doubled at mid-range budgets).</w:t>
+      </w:r>
+    </w:p>
+    <w:p>
+      <w:pPr>
+        <w:spacing w:after="120" w:line="264"/>
+        <w:jc w:val="both"/>
+      </w:pPr>
+      <w:r>
+        <w:t xml:space="preserve">The broader lesson is that cross-modal search indexes should be built, tuned and evaluated with the queries they will actually serve. Natural next steps are a GPU pipeline for caption-guided edges at web scale, combining the graph and quantization methods in IVF-PQ or disk-based graph indexes, and repeating the study with newer encoders.</w:t>
+      </w:r>
+    </w:p>
+    <w:p>
+      <w:pPr>
+        <w:pStyle w:val="Heading1"/>
+      </w:pPr>
+      <w:r>
+        <w:t xml:space="preserve">References</w:t>
       </w:r>
     </w:p>
     <w:p>
@@ -21564,11 +21609,15 @@
           <w:ilvl w:val="0"/>
           <w:numId w:val="3"/>
         </w:numPr>
-        <w:spacing w:after="70" w:line="256"/>
+        <w:spacing w:after="60" w:line="240"/>
         <w:jc w:val="both"/>
       </w:pPr>
       <w:r>
-        <w:t xml:space="preserve">Timing is single-threaded on CPU. To finish in time, independent jobs ran concurrently on separate cores of one server; this may lower absolute QPS (mainly for memory-bound scans on LAION) but never affects recall.</w:t>
+        <w:rPr>
+          <w:sz w:val="22"/>
+          <w:szCs w:val="22"/>
+        </w:rPr>
+        <w:t xml:space="preserve">M. Aumüller, E. Bernhardsson, A. Faithfull. ANN-Benchmarks: a benchmarking tool for approximate nearest neighbor algorithms. Information Systems 87, 2020.</w:t>
       </w:r>
     </w:p>
     <w:p>
@@ -21578,11 +21627,15 @@
           <w:ilvl w:val="0"/>
           <w:numId w:val="3"/>
         </w:numPr>
-        <w:spacing w:after="70" w:line="256"/>
+        <w:spacing w:after="60" w:line="240"/>
         <w:jc w:val="both"/>
       </w:pPr>
       <w:r>
-        <w:t xml:space="preserve">Recall is measured against exact search rather than human relevance, so an approximate “miss” may still be a relevant image (Figure 12).</w:t>
+        <w:rPr>
+          <w:sz w:val="22"/>
+          <w:szCs w:val="22"/>
+        </w:rPr>
+        <w:t xml:space="preserve">M. S. Charikar. Similarity estimation techniques from rounding algorithms. STOC, 2002.</w:t>
       </w:r>
     </w:p>
     <w:p>
@@ -21592,54 +21645,15 @@
           <w:ilvl w:val="0"/>
           <w:numId w:val="3"/>
         </w:numPr>
-        <w:spacing w:after="70" w:line="256"/>
+        <w:spacing w:after="60" w:line="240"/>
         <w:jc w:val="both"/>
       </w:pPr>
       <w:r>
-        <w:t xml:space="preserve">The query-aware methods require a sample of training queries from the same distribution as the real ones; we did not study robustness to a shift between the two.</w:t>
-      </w:r>
-    </w:p>
-    <w:p>
-      <w:pPr>
-        <w:pStyle w:val="Heading1"/>
-      </w:pPr>
-      <w:r>
-        <w:t xml:space="preserve">6 Conclusion</w:t>
-      </w:r>
-    </w:p>
-    <w:p>
-      <w:pPr>
-        <w:spacing w:after="120" w:line="264"/>
-        <w:jc w:val="both"/>
-      </w:pPr>
-      <w:r>
-        <w:t xml:space="preserve">We compared hashing (LSH), quantization (PQ) and graph (HNSW) indexes for text-to-image search on CLIP embeddings, on COCO (122k images) and LAION (1M images), searching each index with both image and text queries. With image queries the classic trade-off holds: HNSW is the fastest and most accurate, PQ the most compact, and LSH the cheapest to build. With text queries every method loses recall at every setting — the data-independent LSH most of all.</w:t>
-      </w:r>
-    </w:p>
-    <w:p>
-      <w:pPr>
-        <w:spacing w:after="120" w:line="264"/>
-        <w:jc w:val="both"/>
-      </w:pPr>
-      <w:r>
-        <w:t xml:space="preserve">A score-margin model explains these results. Text queries' true neighbours are bunched together, which magnifies the error of approximate scoring (LSH, PQ); for LSH a binomial analysis reproduces the measured swap rates and the eight-fold increase in code length that text queries require. Text queries also lie far from every image, which weakens greedy graph routing (HNSW) increasingly as the corpus grows. The model led to three query-aware construction methods that keep the exact ground truth: caption-guided edges in HNSW's unused slots (COCO text recall 0.88 → 0.95, no extra memory), query-weighted OPQ (PQ text recall 0.51 → 0.79 at 64 bytes), and modality-aware LSH centring (text recall roughly doubled at mid-range budgets).</w:t>
-      </w:r>
-    </w:p>
-    <w:p>
-      <w:pPr>
-        <w:spacing w:after="120" w:line="264"/>
-        <w:jc w:val="both"/>
-      </w:pPr>
-      <w:r>
-        <w:t xml:space="preserve">The broader lesson is that cross-modal search indexes should be built, tuned and evaluated with the queries they will actually serve. Natural next steps are a GPU pipeline for caption-guided edges at web scale, combining the graph and quantization methods in IVF-PQ or disk-based graph indexes, and repeating the study with newer encoders.</w:t>
-      </w:r>
-    </w:p>
-    <w:p>
-      <w:pPr>
-        <w:pStyle w:val="Heading1"/>
-      </w:pPr>
-      <w:r>
-        <w:t xml:space="preserve">References</w:t>
+        <w:rPr>
+          <w:sz w:val="22"/>
+          <w:szCs w:val="22"/>
+        </w:rPr>
+        <w:t xml:space="preserve">M. Chen et al. RoarGraph: a projected bipartite graph for efficient cross-modal approximate nearest neighbor search. VLDB, 2024.</w:t>
       </w:r>
     </w:p>
     <w:p>
@@ -21647,17 +21661,17 @@
         <w:pStyle w:val="ListParagraph"/>
         <w:numPr>
           <w:ilvl w:val="0"/>
-          <w:numId w:val="4"/>
+          <w:numId w:val="3"/>
         </w:numPr>
         <w:spacing w:after="60" w:line="240"/>
         <w:jc w:val="both"/>
       </w:pPr>
       <w:r>
         <w:rPr>
-          <w:sz w:val="20"/>
-          <w:szCs w:val="20"/>
+          <w:sz w:val="22"/>
+          <w:szCs w:val="22"/>
         </w:rPr>
-        <w:t xml:space="preserve">M. Aumüller, E. Bernhardsson, A. Faithfull. ANN-Benchmarks: a benchmarking tool for approximate nearest neighbor algorithms. Information Systems 87, 2020.</w:t>
+        <w:t xml:space="preserve">M. Douze et al. The Faiss library. arXiv:2401.08281, 2024.</w:t>
       </w:r>
     </w:p>
     <w:p>
@@ -21665,17 +21679,17 @@
         <w:pStyle w:val="ListParagraph"/>
         <w:numPr>
           <w:ilvl w:val="0"/>
-          <w:numId w:val="4"/>
+          <w:numId w:val="3"/>
         </w:numPr>
         <w:spacing w:after="60" w:line="240"/>
         <w:jc w:val="both"/>
       </w:pPr>
       <w:r>
         <w:rPr>
-          <w:sz w:val="20"/>
-          <w:szCs w:val="20"/>
+          <w:sz w:val="22"/>
+          <w:szCs w:val="22"/>
         </w:rPr>
-        <w:t xml:space="preserve">M. S. Charikar. Similarity estimation techniques from rounding algorithms. STOC, 2002.</w:t>
+        <w:t xml:space="preserve">T. Ge, K. He, Q. Ke, J. Sun. Optimized product quantization. IEEE TPAMI 36(4), 2014.</w:t>
       </w:r>
     </w:p>
     <w:p>
@@ -21683,17 +21697,17 @@
         <w:pStyle w:val="ListParagraph"/>
         <w:numPr>
           <w:ilvl w:val="0"/>
-          <w:numId w:val="4"/>
+          <w:numId w:val="3"/>
         </w:numPr>
         <w:spacing w:after="60" w:line="240"/>
         <w:jc w:val="both"/>
       </w:pPr>
       <w:r>
         <w:rPr>
-          <w:sz w:val="20"/>
-          <w:szCs w:val="20"/>
+          <w:sz w:val="22"/>
+          <w:szCs w:val="22"/>
         </w:rPr>
-        <w:t xml:space="preserve">M. Chen et al. RoarGraph: a projected bipartite graph for efficient cross-modal approximate nearest neighbor search. VLDB, 2024.</w:t>
+        <w:t xml:space="preserve">R. Guo, P. Sun, E. Lindgren, Q. Geng, D. Simcha, F. Chern, S. Kumar. Accelerating large-scale inference with anisotropic vector quantization. ICML, 2020.</w:t>
       </w:r>
     </w:p>
     <w:p>
@@ -21701,17 +21715,17 @@
         <w:pStyle w:val="ListParagraph"/>
         <w:numPr>
           <w:ilvl w:val="0"/>
-          <w:numId w:val="4"/>
+          <w:numId w:val="3"/>
         </w:numPr>
         <w:spacing w:after="60" w:line="240"/>
         <w:jc w:val="both"/>
       </w:pPr>
       <w:r>
         <w:rPr>
-          <w:sz w:val="20"/>
-          <w:szCs w:val="20"/>
+          <w:sz w:val="22"/>
+          <w:szCs w:val="22"/>
         </w:rPr>
-        <w:t xml:space="preserve">M. Douze et al. The Faiss library. arXiv:2401.08281, 2024.</w:t>
+        <w:t xml:space="preserve">E. Jääsaari et al. VIBE: Vector Index Benchmark for Embeddings. arXiv:2505.17810, 2025.</w:t>
       </w:r>
     </w:p>
     <w:p>
@@ -21719,17 +21733,17 @@
         <w:pStyle w:val="ListParagraph"/>
         <w:numPr>
           <w:ilvl w:val="0"/>
-          <w:numId w:val="4"/>
+          <w:numId w:val="3"/>
         </w:numPr>
         <w:spacing w:after="60" w:line="240"/>
         <w:jc w:val="both"/>
       </w:pPr>
       <w:r>
         <w:rPr>
-          <w:sz w:val="20"/>
-          <w:szCs w:val="20"/>
+          <w:sz w:val="22"/>
+          <w:szCs w:val="22"/>
         </w:rPr>
-        <w:t xml:space="preserve">T. Ge, K. He, Q. Ke, J. Sun. Optimized product quantization. IEEE TPAMI 36(4), 2014.</w:t>
+        <w:t xml:space="preserve">S. Jaiswal et al. OOD-DiskANN: efficient and scalable graph ANNS for out-of-distribution queries. arXiv:2211.12850, 2022.</w:t>
       </w:r>
     </w:p>
     <w:p>
@@ -21737,17 +21751,17 @@
         <w:pStyle w:val="ListParagraph"/>
         <w:numPr>
           <w:ilvl w:val="0"/>
-          <w:numId w:val="4"/>
+          <w:numId w:val="3"/>
         </w:numPr>
         <w:spacing w:after="60" w:line="240"/>
         <w:jc w:val="both"/>
       </w:pPr>
       <w:r>
         <w:rPr>
-          <w:sz w:val="20"/>
-          <w:szCs w:val="20"/>
+          <w:sz w:val="22"/>
+          <w:szCs w:val="22"/>
         </w:rPr>
-        <w:t xml:space="preserve">R. Guo, P. Sun, E. Lindgren, Q. Geng, D. Simcha, F. Chern, S. Kumar. Accelerating large-scale inference with anisotropic vector quantization. ICML, 2020.</w:t>
+        <w:t xml:space="preserve">H. Jégou, M. Douze, C. Schmid. Product quantization for nearest neighbor search. IEEE TPAMI 33(1), 2011.</w:t>
       </w:r>
     </w:p>
     <w:p>
@@ -21755,17 +21769,17 @@
         <w:pStyle w:val="ListParagraph"/>
         <w:numPr>
           <w:ilvl w:val="0"/>
-          <w:numId w:val="4"/>
+          <w:numId w:val="3"/>
         </w:numPr>
         <w:spacing w:after="60" w:line="240"/>
         <w:jc w:val="both"/>
       </w:pPr>
       <w:r>
         <w:rPr>
-          <w:sz w:val="20"/>
-          <w:szCs w:val="20"/>
+          <w:sz w:val="22"/>
+          <w:szCs w:val="22"/>
         </w:rPr>
-        <w:t xml:space="preserve">E. Jääsaari et al. VIBE: Vector Index Benchmark for Embeddings. arXiv:2505.17810, 2025.</w:t>
+        <w:t xml:space="preserve">W. Liang, Y. Zhang, Y. Kwon, S. Yeung, J. Zou. Mind the gap: understanding the modality gap in multi-modal contrastive representation learning. NeurIPS, 2022.</w:t>
       </w:r>
     </w:p>
     <w:p>
@@ -21773,17 +21787,17 @@
         <w:pStyle w:val="ListParagraph"/>
         <w:numPr>
           <w:ilvl w:val="0"/>
-          <w:numId w:val="4"/>
+          <w:numId w:val="3"/>
         </w:numPr>
         <w:spacing w:after="60" w:line="240"/>
         <w:jc w:val="both"/>
       </w:pPr>
       <w:r>
         <w:rPr>
-          <w:sz w:val="20"/>
-          <w:szCs w:val="20"/>
+          <w:sz w:val="22"/>
+          <w:szCs w:val="22"/>
         </w:rPr>
-        <w:t xml:space="preserve">S. Jaiswal et al. OOD-DiskANN: efficient and scalable graph ANNS for out-of-distribution queries. arXiv:2211.12850, 2022.</w:t>
+        <w:t xml:space="preserve">T.-Y. Lin et al. Microsoft COCO: common objects in context. ECCV, 2014.</w:t>
       </w:r>
     </w:p>
     <w:p>
@@ -21791,17 +21805,17 @@
         <w:pStyle w:val="ListParagraph"/>
         <w:numPr>
           <w:ilvl w:val="0"/>
-          <w:numId w:val="4"/>
+          <w:numId w:val="3"/>
         </w:numPr>
         <w:spacing w:after="60" w:line="240"/>
         <w:jc w:val="both"/>
       </w:pPr>
       <w:r>
         <w:rPr>
-          <w:sz w:val="20"/>
-          <w:szCs w:val="20"/>
+          <w:sz w:val="22"/>
+          <w:szCs w:val="22"/>
         </w:rPr>
-        <w:t xml:space="preserve">H. Jégou, M. Douze, C. Schmid. Product quantization for nearest neighbor search. IEEE TPAMI 33(1), 2011.</w:t>
+        <w:t xml:space="preserve">Y. A. Malkov, D. A. Yashunin. Efficient and robust approximate nearest neighbor search using hierarchical navigable small world graphs. IEEE TPAMI 42(4), 2020.</w:t>
       </w:r>
     </w:p>
     <w:p>
@@ -21809,17 +21823,17 @@
         <w:pStyle w:val="ListParagraph"/>
         <w:numPr>
           <w:ilvl w:val="0"/>
-          <w:numId w:val="4"/>
+          <w:numId w:val="3"/>
         </w:numPr>
         <w:spacing w:after="60" w:line="240"/>
         <w:jc w:val="both"/>
       </w:pPr>
       <w:r>
         <w:rPr>
-          <w:sz w:val="20"/>
-          <w:szCs w:val="20"/>
+          <w:sz w:val="22"/>
+          <w:szCs w:val="22"/>
         </w:rPr>
-        <w:t xml:space="preserve">W. Liang, Y. Zhang, Y. Kwon, S. Yeung, J. Zou. Mind the gap: understanding the modality gap in multi-modal contrastive representation learning. NeurIPS, 2022.</w:t>
+        <w:t xml:space="preserve">A. Radford et al. Learning transferable visual models from natural language supervision. ICML, 2021.</w:t>
       </w:r>
     </w:p>
     <w:p>
@@ -21827,69 +21841,15 @@
         <w:pStyle w:val="ListParagraph"/>
         <w:numPr>
           <w:ilvl w:val="0"/>
-          <w:numId w:val="4"/>
+          <w:numId w:val="3"/>
         </w:numPr>
         <w:spacing w:after="60" w:line="240"/>
         <w:jc w:val="both"/>
       </w:pPr>
       <w:r>
         <w:rPr>
-          <w:sz w:val="20"/>
-          <w:szCs w:val="20"/>
-        </w:rPr>
-        <w:t xml:space="preserve">T.-Y. Lin et al. Microsoft COCO: common objects in context. ECCV, 2014.</w:t>
-      </w:r>
-    </w:p>
-    <w:p>
-      <w:pPr>
-        <w:pStyle w:val="ListParagraph"/>
-        <w:numPr>
-          <w:ilvl w:val="0"/>
-          <w:numId w:val="4"/>
-        </w:numPr>
-        <w:spacing w:after="60" w:line="240"/>
-        <w:jc w:val="both"/>
-      </w:pPr>
-      <w:r>
-        <w:rPr>
-          <w:sz w:val="20"/>
-          <w:szCs w:val="20"/>
-        </w:rPr>
-        <w:t xml:space="preserve">Y. A. Malkov, D. A. Yashunin. Efficient and robust approximate nearest neighbor search using hierarchical navigable small world graphs. IEEE TPAMI 42(4), 2020.</w:t>
-      </w:r>
-    </w:p>
-    <w:p>
-      <w:pPr>
-        <w:pStyle w:val="ListParagraph"/>
-        <w:numPr>
-          <w:ilvl w:val="0"/>
-          <w:numId w:val="4"/>
-        </w:numPr>
-        <w:spacing w:after="60" w:line="240"/>
-        <w:jc w:val="both"/>
-      </w:pPr>
-      <w:r>
-        <w:rPr>
-          <w:sz w:val="20"/>
-          <w:szCs w:val="20"/>
-        </w:rPr>
-        <w:t xml:space="preserve">A. Radford et al. Learning transferable visual models from natural language supervision. ICML, 2021.</w:t>
-      </w:r>
-    </w:p>
-    <w:p>
-      <w:pPr>
-        <w:pStyle w:val="ListParagraph"/>
-        <w:numPr>
-          <w:ilvl w:val="0"/>
-          <w:numId w:val="4"/>
-        </w:numPr>
-        <w:spacing w:after="60" w:line="240"/>
-        <w:jc w:val="both"/>
-      </w:pPr>
-      <w:r>
-        <w:rPr>
-          <w:sz w:val="20"/>
-          <w:szCs w:val="20"/>
+          <w:sz w:val="22"/>
+          <w:szCs w:val="22"/>
         </w:rPr>
         <w:t xml:space="preserve">C. Schuhmann et al. LAION-400M: open dataset of CLIP-filtered 400 million image-text pairs. arXiv:2111.02114, 2021.</w:t>
       </w:r>
@@ -22110,17 +22070,6 @@
       </w:pPr>
     </w:lvl>
   </w:abstractNum>
-  <w:abstractNum w:abstractNumId="5" w15:restartNumberingAfterBreak="0">
-    <w:multiLevelType w:val="hybridMultilevel"/>
-    <w:lvl w:ilvl="0" w15:tentative="1">
-      <w:start w:val="1"/>
-      <w:numFmt w:val="none"/>
-      <w:lvlJc w:val="left"/>
-      <w:pPr>
-        <w:ind w:left="500" w:hanging="0"/>
-      </w:pPr>
-    </w:lvl>
-  </w:abstractNum>
   <w:num w:numId="1">
     <w:abstractNumId w:val="1"/>
     <w:lvlOverride w:ilvl="0">
@@ -22128,18 +22077,12 @@
     </w:lvlOverride>
   </w:num>
   <w:num w:numId="2">
-    <w:abstractNumId w:val="5"/>
+    <w:abstractNumId w:val="2"/>
     <w:lvlOverride w:ilvl="0">
       <w:startOverride w:val="1"/>
     </w:lvlOverride>
   </w:num>
   <w:num w:numId="3">
-    <w:abstractNumId w:val="2"/>
-    <w:lvlOverride w:ilvl="0">
-      <w:startOverride w:val="1"/>
-    </w:lvlOverride>
-  </w:num>
-  <w:num w:numId="4">
     <w:abstractNumId w:val="4"/>
     <w:lvlOverride w:ilvl="0">
       <w:startOverride w:val="1"/>

</xml_diff>

<commit_message>
Plain report title; define terms before use in abstract and methods
</commit_message>
<xml_diff>
--- a/report/group_XX_report.docx
+++ b/report/group_XX_report.docx
@@ -14,7 +14,7 @@
           <w:sz w:val="34"/>
           <w:szCs w:val="34"/>
         </w:rPr>
-        <w:t xml:space="preserve">When the Query Speaks a Different Language:</w:t>
+        <w:t xml:space="preserve">SC4020 Project 1: Technical Review Report</w:t>
       </w:r>
     </w:p>
     <w:p>
@@ -29,7 +29,7 @@
           <w:sz w:val="28"/>
           <w:szCs w:val="28"/>
         </w:rPr>
-        <w:t xml:space="preserve">Hashing, Quantization and Graph Indexes for Cross-Modal Nearest Neighbour Search</w:t>
+        <w:t xml:space="preserve">Topic: Similarity Search (LSH, PQ and HNSW for Text-to-Image Search)</w:t>
       </w:r>
     </w:p>
     <w:p>
@@ -57,7 +57,7 @@
           <w:sz w:val="20"/>
           <w:szCs w:val="20"/>
         </w:rPr>
-        <w:t xml:space="preserve">SC4020 Project 1: Technical Review (Similarity Search), Nanyang Technological University</w:t>
+        <w:t xml:space="preserve">Nanyang Technological University</w:t>
       </w:r>
     </w:p>
     <w:p>
@@ -102,7 +102,7 @@
           <w:sz w:val="22"/>
           <w:szCs w:val="22"/>
         </w:rPr>
-        <w:t xml:space="preserve">). We compare three ANN methods from three families, LSH with random projection (hashing), Product Quantization (PQ) and HNSW (graph), on MS-COCO (122k images) and LAION (1M images). Every index is searched with both image queries and text queries using the same settings. All three methods lose recall on text queries. Surprisingly, LSH, which does not learn from the data, loses the most (up to 0.40 recall@100, against 0.17 for PQ and 0.19 for HNSW). We show that two properties of text queries cause this: their top-k neighbours have very similar scores, and they are far from every image. Based on this, we improve each method for text queries: caption-guided edges raise HNSW text recall on COCO from 0.88 to 0.95 with no extra memory, query-weighted OPQ raises PQ text recall from 0.51 to 0.79, and centring each modality separately roughly doubles LSH text recall at medium code lengths.</w:t>
+        <w:t xml:space="preserve">). We compare three ANN methods from three families, LSH with random projection (hashing), Product Quantization (PQ) and HNSW (graph), on MS-COCO (122k images) and LAION (1M images). Every index is searched with both image queries and text queries using the same settings. We measure recall, the fraction of the exact top-100 results that each method returns. All three methods lose recall on text queries. Surprisingly, LSH, which does not learn from the data, loses the most (up to 0.40, against 0.17 for PQ and 0.19 for HNSW). We show that two properties of text queries cause this: their top-k neighbours have very similar scores, and they are far from every image. Based on this, we improve each method using a sample of training captions. For HNSW, we add links between images that match the same caption, which raises text recall on COCO from 0.88 to 0.95 with no extra memory. For PQ, we fit the centroids to reduce the score error for captions instead of images, which raises text recall from 0.51 to 0.79. For LSH, we shift text and image vectors by their own mean before hashing, which roughly doubles text recall at medium code lengths.</w:t>
       </w:r>
     </w:p>
     <w:p>
@@ -1811,7 +1811,15 @@
         </m:sSub>
       </m:oMath>
       <w:r>
-        <w:t xml:space="preserve"> from a standard Gaussian distribution. Each hashing function turns an input vector into one bit:</w:t>
+        <w:t xml:space="preserve"> from a standard Gaussian distribution. Each hashing function turns an input vector into one bit (</w:t>
+      </w:r>
+      <m:oMath>
+        <m:r>
+          <m:t xml:space="preserve">1[·]</m:t>
+        </m:r>
+      </m:oMath>
+      <w:r>
+        <w:t xml:space="preserve"> is 1 if the condition holds and 0 otherwise):</w:t>
       </w:r>
     </w:p>
     <w:p>
@@ -1954,7 +1962,7 @@
         </m:r>
       </m:oMath>
       <w:r>
-        <w:t xml:space="preserve">. The whole database is converted into binary vectors once (offline), and at query time only the query is converted (online). We then run linear search on the binary vectors using the Hamming distance, which only needs an XOR and a bit count, so it is much cheaper than a distance on float values. A 512-bit binary vector takes 64 bytes, 32 times less than the 2,048-byte float vector. We use LSH + linear search (FAISS IndexLSH) instead of hash tables because it returns a full top-100 list. Results are averaged over three random seeds (standard deviation of recall below 0.01).</w:t>
+        <w:t xml:space="preserve">. The whole database is converted into binary vectors once (offline), and at query time only the query is converted (online). We then run linear search on the binary vectors using the Hamming distance, which only needs an XOR and a bit count, so it is much cheaper than a distance on float values. A 512-bit binary vector takes 64 bytes, 32 times less than the 2,048-byte float vector. We use LSH + linear search, implemented with IndexLSH from the FAISS library (Douze et al., 2024), instead of hash tables because it returns a full top-100 list. Results are averaged over three random seeds (standard deviation of recall below 0.01).</w:t>
       </w:r>
     </w:p>
     <w:p>
@@ -3920,25 +3928,7 @@
         <w:t xml:space="preserve">mixed</w:t>
       </w:r>
       <w:r>
-        <w:t xml:space="preserve">), add </w:t>
-      </w:r>
-      <m:oMath>
-        <m:r>
-          <m:t xml:space="preserve">0.01·</m:t>
-        </m:r>
-        <m:acc>
-          <m:accPr>
-            <m:chr m:val="̅"/>
-          </m:accPr>
-          <m:e>
-            <m:r>
-              <m:t xml:space="preserve">λ</m:t>
-            </m:r>
-          </m:e>
-        </m:acc>
-      </m:oMath>
-      <w:r>
-        <w:t xml:space="preserve"> to its eigenvalues for stability, and combine it with the OPQ rotation. The extra query cost is one </w:t>
+        <w:t xml:space="preserve">), add a small constant to its eigenvalues for stability, and combine it with the OPQ rotation. The extra query cost is one </w:t>
       </w:r>
       <m:oMath>
         <m:r>
@@ -3946,7 +3936,7 @@
         </m:r>
       </m:oMath>
       <w:r>
-        <w:t xml:space="preserve"> matrix–vector product. The idea is related to ScaNN's anisotropic loss (Guo et al., 2020), which also weights quantization error by its effect on inner products.</w:t>
+        <w:t xml:space="preserve"> matrix–vector product.</w:t>
       </w:r>
     </w:p>
     <w:p>
@@ -4581,7 +4571,27 @@
         <w:jc w:val="both"/>
       </w:pPr>
       <w:r>
-        <w:t xml:space="preserve">The new edges go into bottom-layer slots that HNSW has allocated but left empty (the average degree is 21.6 on COCO and 23.1 on LAION, out of 64), so memory and the search code do not change. As ablations we also try (i) starting the search from the true neighbours of the most similar training captions, and (ii) inserting the captions into the graph as extra nodes that are never returned.</w:t>
+        <w:t xml:space="preserve">The new edges go into bottom-layer slots that HNSW has allocated but left empty (the average degree is 21.6 on COCO and 23.1 on LAION, out of 64), so memory and the search code do not change. As ablations we also try two other uses of the captions: </w:t>
+      </w:r>
+      <w:r>
+        <w:rPr>
+          <w:i/>
+          <w:iCs/>
+        </w:rPr>
+        <w:t xml:space="preserve">caption entry points</w:t>
+      </w:r>
+      <w:r>
+        <w:t xml:space="preserve">, which start the search from the true neighbours of the most similar training captions, and </w:t>
+      </w:r>
+      <w:r>
+        <w:rPr>
+          <w:i/>
+          <w:iCs/>
+        </w:rPr>
+        <w:t xml:space="preserve">captions as graph nodes</w:t>
+      </w:r>
+      <w:r>
+        <w:t xml:space="preserve">, which insert the captions into the graph as extra nodes that are never returned.</w:t>
       </w:r>
     </w:p>
     <w:p>
@@ -5317,7 +5327,7 @@
         <w:t xml:space="preserve">Protocol.</w:t>
       </w:r>
       <w:r>
-        <w:t xml:space="preserve"> We follow VIBE (Jääsaari et al., 2026) and ann-benchmarks (Aumüller et al., 2020). (i) Indexes are built from the database only and never see a test query. (ii) Each index is built once and searched with both image and text queries using the same parameters, so any difference comes from the queries. (iii) Queries are sent one at a time on a single CPU thread, and we report the fastest of several runs. All runs used one server (2× AMD EPYC 7742) with FAISS 1.15.1 (Douze et al., 2024) and fixed random seeds.</w:t>
+        <w:t xml:space="preserve"> We follow VIBE (Jääsaari et al., 2026) and ann-benchmarks (Aumüller et al., 2020). (i) Indexes are built from the database only and never see a test query. (ii) Each index is built once and searched with both image and text queries using the same parameters, so any difference comes from the queries. (iii) Queries are sent one at a time on a single CPU thread, and we report the fastest of several runs. All runs used one server (2× AMD EPYC 7742) with FAISS 1.15.1 and fixed random seeds.</w:t>
       </w:r>
     </w:p>
     <w:p>
@@ -18018,24 +18028,6 @@
           <w:szCs w:val="22"/>
         </w:rPr>
         <w:t xml:space="preserve">T. Ge, K. He, Q. Ke, J. Sun. Optimized product quantization. IEEE TPAMI 36(4), 2014.</w:t>
-      </w:r>
-    </w:p>
-    <w:p>
-      <w:pPr>
-        <w:pStyle w:val="ListParagraph"/>
-        <w:numPr>
-          <w:ilvl w:val="0"/>
-          <w:numId w:val="3"/>
-        </w:numPr>
-        <w:spacing w:after="60" w:line="240"/>
-        <w:jc w:val="both"/>
-      </w:pPr>
-      <w:r>
-        <w:rPr>
-          <w:sz w:val="22"/>
-          <w:szCs w:val="22"/>
-        </w:rPr>
-        <w:t xml:space="preserve">R. Guo, P. Sun, E. Lindgren, Q. Geng, D. Simcha, F. Chern, S. Kumar. Accelerating large-scale inference with anisotropic vector quantization. ICML, 2020.</w:t>
       </w:r>
     </w:p>
     <w:p>
@@ -18270,7 +18262,7 @@
         <w:sz w:val="17"/>
         <w:szCs w:val="17"/>
       </w:rPr>
-      <w:t xml:space="preserve">SC4020 Technical Review: Cross-Modal Nearest Neighbour Search</w:t>
+      <w:t xml:space="preserve">SC4020 Project 1 Report: Similarity Search</w:t>
     </w:r>
   </w:p>
 </w:hdr>

</xml_diff>

<commit_message>
Explain image queries as in-distribution baseline
</commit_message>
<xml_diff>
--- a/report/group_XX_report.docx
+++ b/report/group_XX_report.docx
@@ -162,7 +162,7 @@
         <w:t xml:space="preserve">cross-modal</w:t>
       </w:r>
       <w:r>
-        <w:t xml:space="preserve"> search). However, the two modalities do not overlap in this space. Each one sits in its own narrow cone, and the two cones are far apart (Liang et al., 2022). In our data, a caption and its own image have a cosine similarity of only about 0.3. So an index built from images receives queries from a region it has never seen. The VIBE benchmark (Jääsaari et al., 2026) shows that ANN methods become much slower on such out-of-distribution (OOD) queries, and graph methods such as RoarGraph (Chen et al., 2024) and OOD-DiskANN (Jaiswal et al., 2022) use training queries to handle them. We study the problem across three different ANN families.</w:t>
+        <w:t xml:space="preserve"> search). However, the two modalities do not overlap in this space. Each one sits in its own narrow cone, and the two cones are far apart (Liang et al., 2022). In our data, a caption and its own image have a cosine similarity of only about 0.3. So an index built from images receives queries from a region it has never seen. The VIBE benchmark (Jääsaari et al., 2026) shows that ANN methods become much slower on such out-of-distribution (OOD) queries, and graph methods such as RoarGraph (Chen et al., 2024) and OOD-DiskANN (Jaiswal et al., 2022) use training queries to handle them. We study the problem across three different ANN families. As a baseline, we also search each index with image queries. These come from the same distribution as the database (in-distribution), as in standard ANN benchmarks. Comparing them with text queries on the same index shows how much recall is lost only because the query is text.</w:t>
       </w:r>
     </w:p>
     <w:p>
@@ -5311,7 +5311,7 @@
         <w:t xml:space="preserve">Datasets.</w:t>
       </w:r>
       <w:r>
-        <w:t xml:space="preserve"> COCO (Lin et al., 2014) and LAION (Schuhmann et al., 2021) differ in size (8×) and in the kind of text: clean human-written captions on COCO and noisy web text on LAION (Table 2). On COCO the image and text queries describe the same 1,000 images, so the only difference between the two query sets is which CLIP encoder produced them.</w:t>
+        <w:t xml:space="preserve"> COCO (Lin et al., 2014) and LAION (Schuhmann et al., 2021) differ in size (8×) and in the kind of text: clean human-written captions on COCO and noisy web text on LAION (Table 2). An image query is a held-out image that is not in the database. It searches the same image database (image-to-image search) and serves as the in-distribution baseline. On COCO the image and text queries describe the same 1,000 images, so the only difference between the two query sets is which CLIP encoder produced them.</w:t>
       </w:r>
     </w:p>
     <w:p>

</xml_diff>